<commit_message>
Updated the Incident Response Plan secondary document (the Threat Remediation section was unclear as to handling of rejected threats)
</commit_message>
<xml_diff>
--- a/source/reference_documents/secondary_documents/foundation phase/Incident Response Plan/Incident Response Plan.docx
+++ b/source/reference_documents/secondary_documents/foundation phase/Incident Response Plan/Incident Response Plan.docx
@@ -31,7 +31,7 @@
         <w:t>1</w:t>
       </w:r>
       <w:r>
-        <w:t>6</w:t>
+        <w:t>7</w:t>
       </w:r>
     </w:p>
     <w:p>
@@ -51,7 +51,7 @@
         <w:rPr>
           <w:noProof/>
         </w:rPr>
-        <w:t>4/11/25 2:39 PM</w:t>
+        <w:t>7/2/26 10:31 AM</w:t>
       </w:r>
       <w:r>
         <w:fldChar w:fldCharType="end"/>
@@ -152,34 +152,42 @@
     </w:p>
     <w:p>
       <w:pPr>
+        <w:spacing w:after="240"/>
         <w:jc w:val="both"/>
         <w:rPr>
           <w:color w:val="FF0000"/>
         </w:rPr>
       </w:pPr>
       <w:r>
-        <w:t xml:space="preserve">This document is motivated by the need to have formal processes in place for the management of incidents affecting safety-critical, cyber-physical systems in the field for certification of compliance to standards such as </w:t>
-      </w:r>
-      <w:r>
-        <w:rPr>
-          <w:b/>
-          <w:bCs/>
-        </w:rPr>
-        <w:t>ISO</w:t>
-      </w:r>
-      <w:r>
-        <w:rPr>
-          <w:b/>
-          <w:bCs/>
-        </w:rPr>
-        <w:t>/SAE</w:t>
-      </w:r>
-      <w:r>
-        <w:rPr>
-          <w:b/>
-          <w:bCs/>
-        </w:rPr>
-        <w:t xml:space="preserve"> 21434</w:t>
+        <w:t>This document is motivated by the need to have formal processes in place for the management of incidents affecting safety-critical, cyber-physical systems.</w:t>
+      </w:r>
+    </w:p>
+    <w:p>
+      <w:pPr>
+        <w:pStyle w:val="Note"/>
+      </w:pPr>
+      <w:bookmarkStart w:id="4" w:name="_f5diy2ktdyyf" w:colFirst="0" w:colLast="0"/>
+      <w:bookmarkEnd w:id="4"/>
+      <w:r>
+        <w:rPr>
+          <w:b/>
+          <w:bCs/>
+          <w:color w:val="0070C0"/>
+        </w:rPr>
+        <w:t>Note:</w:t>
+      </w:r>
+      <w:r>
+        <w:tab/>
+        <w:t xml:space="preserve">Within the context of this document, the terms </w:t>
+      </w:r>
+      <w:r>
+        <w:rPr>
+          <w:b/>
+          <w:bCs/>
+          <w:i/>
+          <w:iCs/>
+        </w:rPr>
+        <w:t>security</w:t>
       </w:r>
       <w:r>
         <w:t xml:space="preserve"> and </w:t>
@@ -188,15 +196,46 @@
         <w:rPr>
           <w:b/>
           <w:bCs/>
-        </w:rPr>
-        <w:t xml:space="preserve">ISO </w:t>
-      </w:r>
-      <w:r>
-        <w:rPr>
-          <w:b/>
-          <w:bCs/>
-        </w:rPr>
-        <w:t>26262</w:t>
+          <w:i/>
+          <w:iCs/>
+        </w:rPr>
+        <w:t>cybersecurity</w:t>
+      </w:r>
+      <w:r>
+        <w:t xml:space="preserve"> are used interchangeably. It is presumed that the term </w:t>
+      </w:r>
+      <w:r>
+        <w:rPr>
+          <w:b/>
+          <w:bCs/>
+          <w:i/>
+          <w:iCs/>
+        </w:rPr>
+        <w:t>security</w:t>
+      </w:r>
+      <w:r>
+        <w:t xml:space="preserve"> is being used in reference to </w:t>
+      </w:r>
+      <w:r>
+        <w:rPr>
+          <w:b/>
+          <w:bCs/>
+          <w:i/>
+          <w:iCs/>
+        </w:rPr>
+        <w:t>cybersecurity</w:t>
+      </w:r>
+      <w:r>
+        <w:t xml:space="preserve"> and not </w:t>
+      </w:r>
+      <w:r>
+        <w:rPr>
+          <w:b/>
+          <w:bCs/>
+          <w:i/>
+          <w:iCs/>
+        </w:rPr>
+        <w:t>physical security</w:t>
       </w:r>
       <w:r>
         <w:t>.</w:t>
@@ -207,8 +246,6 @@
         <w:pStyle w:val="Heading1"/>
         <w:jc w:val="both"/>
       </w:pPr>
-      <w:bookmarkStart w:id="4" w:name="_f5diy2ktdyyf" w:colFirst="0" w:colLast="0"/>
-      <w:bookmarkEnd w:id="4"/>
       <w:r>
         <w:t>License</w:t>
       </w:r>
@@ -227,7 +264,19 @@
         <w:rPr>
           <w:lang w:val="en-US"/>
         </w:rPr>
-        <w:t xml:space="preserve">was created by </w:t>
+        <w:t xml:space="preserve">was </w:t>
+      </w:r>
+      <w:r>
+        <w:rPr>
+          <w:lang w:val="en-US"/>
+        </w:rPr>
+        <w:t xml:space="preserve">originally </w:t>
+      </w:r>
+      <w:r>
+        <w:rPr>
+          <w:lang w:val="en-US"/>
+        </w:rPr>
+        <w:t xml:space="preserve">created by </w:t>
       </w:r>
       <w:r>
         <w:rPr>
@@ -530,7 +579,6 @@
         <w:tc>
           <w:tcPr>
             <w:tcW w:w="1520" w:type="dxa"/>
-            <w:shd w:val="clear" w:color="auto" w:fill="auto"/>
             <w:tcMar>
               <w:top w:w="100" w:type="dxa"/>
               <w:left w:w="100" w:type="dxa"/>
@@ -561,7 +609,6 @@
         <w:tc>
           <w:tcPr>
             <w:tcW w:w="3420" w:type="dxa"/>
-            <w:shd w:val="clear" w:color="auto" w:fill="auto"/>
             <w:tcMar>
               <w:top w:w="100" w:type="dxa"/>
               <w:left w:w="100" w:type="dxa"/>
@@ -587,7 +634,6 @@
         <w:tc>
           <w:tcPr>
             <w:tcW w:w="1520" w:type="dxa"/>
-            <w:shd w:val="clear" w:color="auto" w:fill="auto"/>
             <w:tcMar>
               <w:top w:w="100" w:type="dxa"/>
               <w:left w:w="100" w:type="dxa"/>
@@ -618,7 +664,6 @@
         <w:tc>
           <w:tcPr>
             <w:tcW w:w="3420" w:type="dxa"/>
-            <w:shd w:val="clear" w:color="auto" w:fill="auto"/>
             <w:tcMar>
               <w:top w:w="100" w:type="dxa"/>
               <w:left w:w="100" w:type="dxa"/>
@@ -650,7 +695,6 @@
         <w:tc>
           <w:tcPr>
             <w:tcW w:w="1520" w:type="dxa"/>
-            <w:shd w:val="clear" w:color="auto" w:fill="auto"/>
             <w:tcMar>
               <w:top w:w="100" w:type="dxa"/>
               <w:left w:w="100" w:type="dxa"/>
@@ -681,7 +725,6 @@
         <w:tc>
           <w:tcPr>
             <w:tcW w:w="3420" w:type="dxa"/>
-            <w:shd w:val="clear" w:color="auto" w:fill="auto"/>
             <w:tcMar>
               <w:top w:w="100" w:type="dxa"/>
               <w:left w:w="100" w:type="dxa"/>
@@ -1038,7 +1081,6 @@
         <w:tc>
           <w:tcPr>
             <w:tcW w:w="1520" w:type="dxa"/>
-            <w:shd w:val="clear" w:color="auto" w:fill="auto"/>
             <w:tcMar>
               <w:top w:w="100" w:type="dxa"/>
               <w:left w:w="100" w:type="dxa"/>
@@ -1069,7 +1111,6 @@
         <w:tc>
           <w:tcPr>
             <w:tcW w:w="3780" w:type="dxa"/>
-            <w:shd w:val="clear" w:color="auto" w:fill="auto"/>
             <w:tcMar>
               <w:top w:w="100" w:type="dxa"/>
               <w:left w:w="100" w:type="dxa"/>
@@ -1101,7 +1142,6 @@
         <w:tc>
           <w:tcPr>
             <w:tcW w:w="1520" w:type="dxa"/>
-            <w:shd w:val="clear" w:color="auto" w:fill="auto"/>
             <w:tcMar>
               <w:top w:w="100" w:type="dxa"/>
               <w:left w:w="100" w:type="dxa"/>
@@ -1132,7 +1172,6 @@
         <w:tc>
           <w:tcPr>
             <w:tcW w:w="3780" w:type="dxa"/>
-            <w:shd w:val="clear" w:color="auto" w:fill="auto"/>
             <w:tcMar>
               <w:top w:w="100" w:type="dxa"/>
               <w:left w:w="100" w:type="dxa"/>
@@ -1164,7 +1203,6 @@
         <w:tc>
           <w:tcPr>
             <w:tcW w:w="1520" w:type="dxa"/>
-            <w:shd w:val="clear" w:color="auto" w:fill="auto"/>
             <w:tcMar>
               <w:top w:w="100" w:type="dxa"/>
               <w:left w:w="100" w:type="dxa"/>
@@ -1195,7 +1233,6 @@
         <w:tc>
           <w:tcPr>
             <w:tcW w:w="3780" w:type="dxa"/>
-            <w:shd w:val="clear" w:color="auto" w:fill="auto"/>
             <w:tcMar>
               <w:top w:w="100" w:type="dxa"/>
               <w:left w:w="100" w:type="dxa"/>
@@ -1539,7 +1576,6 @@
         <w:tc>
           <w:tcPr>
             <w:tcW w:w="1520" w:type="dxa"/>
-            <w:shd w:val="clear" w:color="auto" w:fill="auto"/>
             <w:tcMar>
               <w:top w:w="100" w:type="dxa"/>
               <w:left w:w="100" w:type="dxa"/>
@@ -1570,7 +1606,6 @@
         <w:tc>
           <w:tcPr>
             <w:tcW w:w="2340" w:type="dxa"/>
-            <w:shd w:val="clear" w:color="auto" w:fill="auto"/>
             <w:tcMar>
               <w:top w:w="100" w:type="dxa"/>
               <w:left w:w="100" w:type="dxa"/>
@@ -1593,7 +1628,6 @@
         <w:tc>
           <w:tcPr>
             <w:tcW w:w="1520" w:type="dxa"/>
-            <w:shd w:val="clear" w:color="auto" w:fill="auto"/>
             <w:tcMar>
               <w:top w:w="100" w:type="dxa"/>
               <w:left w:w="100" w:type="dxa"/>
@@ -1624,7 +1658,6 @@
         <w:tc>
           <w:tcPr>
             <w:tcW w:w="2340" w:type="dxa"/>
-            <w:shd w:val="clear" w:color="auto" w:fill="auto"/>
             <w:tcMar>
               <w:top w:w="100" w:type="dxa"/>
               <w:left w:w="100" w:type="dxa"/>
@@ -1659,7 +1692,6 @@
         <w:tc>
           <w:tcPr>
             <w:tcW w:w="1520" w:type="dxa"/>
-            <w:shd w:val="clear" w:color="auto" w:fill="auto"/>
             <w:tcMar>
               <w:top w:w="100" w:type="dxa"/>
               <w:left w:w="100" w:type="dxa"/>
@@ -1690,7 +1722,6 @@
         <w:tc>
           <w:tcPr>
             <w:tcW w:w="2340" w:type="dxa"/>
-            <w:shd w:val="clear" w:color="auto" w:fill="auto"/>
             <w:tcMar>
               <w:top w:w="100" w:type="dxa"/>
               <w:left w:w="100" w:type="dxa"/>
@@ -2118,7 +2149,6 @@
         <w:tc>
           <w:tcPr>
             <w:tcW w:w="1520" w:type="dxa"/>
-            <w:shd w:val="clear" w:color="auto" w:fill="auto"/>
             <w:tcMar>
               <w:top w:w="100" w:type="dxa"/>
               <w:left w:w="100" w:type="dxa"/>
@@ -2149,7 +2179,6 @@
         <w:tc>
           <w:tcPr>
             <w:tcW w:w="2790" w:type="dxa"/>
-            <w:shd w:val="clear" w:color="auto" w:fill="auto"/>
             <w:tcMar>
               <w:top w:w="100" w:type="dxa"/>
               <w:left w:w="100" w:type="dxa"/>
@@ -2175,7 +2204,6 @@
         <w:tc>
           <w:tcPr>
             <w:tcW w:w="1520" w:type="dxa"/>
-            <w:shd w:val="clear" w:color="auto" w:fill="auto"/>
             <w:tcMar>
               <w:top w:w="100" w:type="dxa"/>
               <w:left w:w="100" w:type="dxa"/>
@@ -2206,7 +2234,6 @@
         <w:tc>
           <w:tcPr>
             <w:tcW w:w="2790" w:type="dxa"/>
-            <w:shd w:val="clear" w:color="auto" w:fill="auto"/>
             <w:tcMar>
               <w:top w:w="100" w:type="dxa"/>
               <w:left w:w="100" w:type="dxa"/>
@@ -2238,7 +2265,6 @@
         <w:tc>
           <w:tcPr>
             <w:tcW w:w="1520" w:type="dxa"/>
-            <w:shd w:val="clear" w:color="auto" w:fill="auto"/>
             <w:tcMar>
               <w:top w:w="100" w:type="dxa"/>
               <w:left w:w="100" w:type="dxa"/>
@@ -2269,7 +2295,6 @@
         <w:tc>
           <w:tcPr>
             <w:tcW w:w="2790" w:type="dxa"/>
-            <w:shd w:val="clear" w:color="auto" w:fill="auto"/>
             <w:tcMar>
               <w:top w:w="100" w:type="dxa"/>
               <w:left w:w="100" w:type="dxa"/>
@@ -2773,7 +2798,6 @@
         <w:tc>
           <w:tcPr>
             <w:tcW w:w="1520" w:type="dxa"/>
-            <w:shd w:val="clear" w:color="auto" w:fill="auto"/>
             <w:tcMar>
               <w:top w:w="100" w:type="dxa"/>
               <w:left w:w="100" w:type="dxa"/>
@@ -2804,7 +2828,6 @@
         <w:tc>
           <w:tcPr>
             <w:tcW w:w="2340" w:type="dxa"/>
-            <w:shd w:val="clear" w:color="auto" w:fill="auto"/>
             <w:tcMar>
               <w:top w:w="100" w:type="dxa"/>
               <w:left w:w="100" w:type="dxa"/>
@@ -2830,7 +2853,6 @@
         <w:tc>
           <w:tcPr>
             <w:tcW w:w="1520" w:type="dxa"/>
-            <w:shd w:val="clear" w:color="auto" w:fill="auto"/>
             <w:tcMar>
               <w:top w:w="100" w:type="dxa"/>
               <w:left w:w="100" w:type="dxa"/>
@@ -2861,7 +2883,6 @@
         <w:tc>
           <w:tcPr>
             <w:tcW w:w="2340" w:type="dxa"/>
-            <w:shd w:val="clear" w:color="auto" w:fill="auto"/>
             <w:tcMar>
               <w:top w:w="100" w:type="dxa"/>
               <w:left w:w="100" w:type="dxa"/>
@@ -2893,7 +2914,6 @@
         <w:tc>
           <w:tcPr>
             <w:tcW w:w="1520" w:type="dxa"/>
-            <w:shd w:val="clear" w:color="auto" w:fill="auto"/>
             <w:tcMar>
               <w:top w:w="100" w:type="dxa"/>
               <w:left w:w="100" w:type="dxa"/>
@@ -2924,7 +2944,6 @@
         <w:tc>
           <w:tcPr>
             <w:tcW w:w="2340" w:type="dxa"/>
-            <w:shd w:val="clear" w:color="auto" w:fill="auto"/>
             <w:tcMar>
               <w:top w:w="100" w:type="dxa"/>
               <w:left w:w="100" w:type="dxa"/>
@@ -3352,7 +3371,6 @@
         <w:tc>
           <w:tcPr>
             <w:tcW w:w="1520" w:type="dxa"/>
-            <w:shd w:val="clear" w:color="auto" w:fill="auto"/>
             <w:tcMar>
               <w:top w:w="100" w:type="dxa"/>
               <w:left w:w="100" w:type="dxa"/>
@@ -3383,7 +3401,6 @@
         <w:tc>
           <w:tcPr>
             <w:tcW w:w="6840" w:type="dxa"/>
-            <w:shd w:val="clear" w:color="auto" w:fill="auto"/>
             <w:tcMar>
               <w:top w:w="100" w:type="dxa"/>
               <w:left w:w="100" w:type="dxa"/>
@@ -3415,7 +3432,6 @@
         <w:tc>
           <w:tcPr>
             <w:tcW w:w="1520" w:type="dxa"/>
-            <w:shd w:val="clear" w:color="auto" w:fill="auto"/>
             <w:tcMar>
               <w:top w:w="100" w:type="dxa"/>
               <w:left w:w="100" w:type="dxa"/>
@@ -3446,7 +3462,6 @@
         <w:tc>
           <w:tcPr>
             <w:tcW w:w="6840" w:type="dxa"/>
-            <w:shd w:val="clear" w:color="auto" w:fill="auto"/>
             <w:tcMar>
               <w:top w:w="100" w:type="dxa"/>
               <w:left w:w="100" w:type="dxa"/>
@@ -3469,7 +3484,6 @@
         <w:tc>
           <w:tcPr>
             <w:tcW w:w="1520" w:type="dxa"/>
-            <w:shd w:val="clear" w:color="auto" w:fill="auto"/>
             <w:tcMar>
               <w:top w:w="100" w:type="dxa"/>
               <w:left w:w="100" w:type="dxa"/>
@@ -3500,7 +3514,6 @@
         <w:tc>
           <w:tcPr>
             <w:tcW w:w="6840" w:type="dxa"/>
-            <w:shd w:val="clear" w:color="auto" w:fill="auto"/>
             <w:tcMar>
               <w:top w:w="100" w:type="dxa"/>
               <w:left w:w="100" w:type="dxa"/>
@@ -3824,7 +3837,6 @@
         <w:tc>
           <w:tcPr>
             <w:tcW w:w="1520" w:type="dxa"/>
-            <w:shd w:val="clear" w:color="auto" w:fill="auto"/>
             <w:tcMar>
               <w:top w:w="100" w:type="dxa"/>
               <w:left w:w="100" w:type="dxa"/>
@@ -3855,7 +3867,6 @@
         <w:tc>
           <w:tcPr>
             <w:tcW w:w="3420" w:type="dxa"/>
-            <w:shd w:val="clear" w:color="auto" w:fill="auto"/>
             <w:tcMar>
               <w:top w:w="100" w:type="dxa"/>
               <w:left w:w="100" w:type="dxa"/>
@@ -3893,7 +3904,6 @@
         <w:tc>
           <w:tcPr>
             <w:tcW w:w="1520" w:type="dxa"/>
-            <w:shd w:val="clear" w:color="auto" w:fill="auto"/>
             <w:tcMar>
               <w:top w:w="100" w:type="dxa"/>
               <w:left w:w="100" w:type="dxa"/>
@@ -3924,7 +3934,6 @@
         <w:tc>
           <w:tcPr>
             <w:tcW w:w="3420" w:type="dxa"/>
-            <w:shd w:val="clear" w:color="auto" w:fill="auto"/>
             <w:tcMar>
               <w:top w:w="100" w:type="dxa"/>
               <w:left w:w="100" w:type="dxa"/>
@@ -3956,7 +3965,6 @@
         <w:tc>
           <w:tcPr>
             <w:tcW w:w="1520" w:type="dxa"/>
-            <w:shd w:val="clear" w:color="auto" w:fill="auto"/>
             <w:tcMar>
               <w:top w:w="100" w:type="dxa"/>
               <w:left w:w="100" w:type="dxa"/>
@@ -3987,7 +3995,6 @@
         <w:tc>
           <w:tcPr>
             <w:tcW w:w="3420" w:type="dxa"/>
-            <w:shd w:val="clear" w:color="auto" w:fill="auto"/>
             <w:tcMar>
               <w:top w:w="100" w:type="dxa"/>
               <w:left w:w="100" w:type="dxa"/>
@@ -4236,7 +4243,6 @@
         <w:tc>
           <w:tcPr>
             <w:tcW w:w="1520" w:type="dxa"/>
-            <w:shd w:val="clear" w:color="auto" w:fill="auto"/>
             <w:tcMar>
               <w:top w:w="100" w:type="dxa"/>
               <w:left w:w="100" w:type="dxa"/>
@@ -4267,7 +4273,6 @@
         <w:tc>
           <w:tcPr>
             <w:tcW w:w="3240" w:type="dxa"/>
-            <w:shd w:val="clear" w:color="auto" w:fill="auto"/>
             <w:tcMar>
               <w:top w:w="100" w:type="dxa"/>
               <w:left w:w="100" w:type="dxa"/>
@@ -4290,7 +4295,6 @@
         <w:tc>
           <w:tcPr>
             <w:tcW w:w="1520" w:type="dxa"/>
-            <w:shd w:val="clear" w:color="auto" w:fill="auto"/>
             <w:tcMar>
               <w:top w:w="100" w:type="dxa"/>
               <w:left w:w="100" w:type="dxa"/>
@@ -4321,7 +4325,6 @@
         <w:tc>
           <w:tcPr>
             <w:tcW w:w="3240" w:type="dxa"/>
-            <w:shd w:val="clear" w:color="auto" w:fill="auto"/>
             <w:tcMar>
               <w:top w:w="100" w:type="dxa"/>
               <w:left w:w="100" w:type="dxa"/>
@@ -4347,7 +4350,6 @@
         <w:tc>
           <w:tcPr>
             <w:tcW w:w="1520" w:type="dxa"/>
-            <w:shd w:val="clear" w:color="auto" w:fill="auto"/>
             <w:tcMar>
               <w:top w:w="100" w:type="dxa"/>
               <w:left w:w="100" w:type="dxa"/>
@@ -4378,7 +4380,6 @@
         <w:tc>
           <w:tcPr>
             <w:tcW w:w="3240" w:type="dxa"/>
-            <w:shd w:val="clear" w:color="auto" w:fill="auto"/>
             <w:tcMar>
               <w:top w:w="100" w:type="dxa"/>
               <w:left w:w="100" w:type="dxa"/>
@@ -4581,6 +4582,7 @@
         <w:pStyle w:val="Heading2"/>
       </w:pPr>
       <w:r>
+        <w:lastRenderedPageBreak/>
         <w:t>Threat Remediation</w:t>
       </w:r>
     </w:p>
@@ -4607,7 +4609,6 @@
         <w:tc>
           <w:tcPr>
             <w:tcW w:w="1520" w:type="dxa"/>
-            <w:shd w:val="clear" w:color="auto" w:fill="auto"/>
             <w:tcMar>
               <w:top w:w="100" w:type="dxa"/>
               <w:left w:w="100" w:type="dxa"/>
@@ -4638,7 +4639,6 @@
         <w:tc>
           <w:tcPr>
             <w:tcW w:w="3240" w:type="dxa"/>
-            <w:shd w:val="clear" w:color="auto" w:fill="auto"/>
             <w:tcMar>
               <w:top w:w="100" w:type="dxa"/>
               <w:left w:w="100" w:type="dxa"/>
@@ -4664,7 +4664,6 @@
         <w:tc>
           <w:tcPr>
             <w:tcW w:w="1520" w:type="dxa"/>
-            <w:shd w:val="clear" w:color="auto" w:fill="auto"/>
             <w:tcMar>
               <w:top w:w="100" w:type="dxa"/>
               <w:left w:w="100" w:type="dxa"/>
@@ -4695,7 +4694,6 @@
         <w:tc>
           <w:tcPr>
             <w:tcW w:w="3240" w:type="dxa"/>
-            <w:shd w:val="clear" w:color="auto" w:fill="auto"/>
             <w:tcMar>
               <w:top w:w="100" w:type="dxa"/>
               <w:left w:w="100" w:type="dxa"/>
@@ -4727,7 +4725,6 @@
         <w:tc>
           <w:tcPr>
             <w:tcW w:w="1520" w:type="dxa"/>
-            <w:shd w:val="clear" w:color="auto" w:fill="auto"/>
             <w:tcMar>
               <w:top w:w="100" w:type="dxa"/>
               <w:left w:w="100" w:type="dxa"/>
@@ -4758,7 +4755,6 @@
         <w:tc>
           <w:tcPr>
             <w:tcW w:w="3240" w:type="dxa"/>
-            <w:shd w:val="clear" w:color="auto" w:fill="auto"/>
             <w:tcMar>
               <w:top w:w="100" w:type="dxa"/>
               <w:left w:w="100" w:type="dxa"/>
@@ -4925,7 +4921,13 @@
         <w:t>hreat</w:t>
       </w:r>
       <w:r>
-        <w:t xml:space="preserve"> notification is sent.</w:t>
+        <w:t xml:space="preserve"> notification is sent</w:t>
+      </w:r>
+      <w:r>
+        <w:t xml:space="preserve"> to the Security SME for review</w:t>
+      </w:r>
+      <w:r>
+        <w:t>.</w:t>
       </w:r>
       <w:r>
         <w:t xml:space="preserve"> Otherwise</w:t>
@@ -4999,14 +5001,67 @@
     </w:p>
     <w:p>
       <w:pPr>
-        <w:rPr>
-          <w:sz w:val="32"/>
-          <w:szCs w:val="32"/>
-        </w:rPr>
-      </w:pPr>
-      <w:r>
-        <w:lastRenderedPageBreak/>
-        <w:br w:type="page"/>
+        <w:spacing w:after="240"/>
+        <w:ind w:left="720" w:hanging="720"/>
+        <w:jc w:val="both"/>
+      </w:pPr>
+      <w:r>
+        <w:rPr>
+          <w:b/>
+          <w:bCs/>
+          <w:color w:val="0070C0"/>
+        </w:rPr>
+        <w:t>Note:</w:t>
+      </w:r>
+      <w:r>
+        <w:rPr>
+          <w:b/>
+          <w:bCs/>
+          <w:color w:val="0070C0"/>
+        </w:rPr>
+        <w:tab/>
+      </w:r>
+      <w:r>
+        <w:t>The Security SME may either accept rejected threats</w:t>
+      </w:r>
+      <w:r>
+        <w:t xml:space="preserve"> or re-triage the threat</w:t>
+      </w:r>
+      <w:r>
+        <w:t>,</w:t>
+      </w:r>
+      <w:r>
+        <w:t xml:space="preserve"> add</w:t>
+      </w:r>
+      <w:r>
+        <w:t>ing additional</w:t>
+      </w:r>
+      <w:r>
+        <w:t xml:space="preserve"> details</w:t>
+      </w:r>
+      <w:r>
+        <w:t>,</w:t>
+      </w:r>
+      <w:r>
+        <w:t xml:space="preserve"> and </w:t>
+      </w:r>
+      <w:r>
+        <w:t xml:space="preserve">then </w:t>
+      </w:r>
+      <w:r>
+        <w:t>submit</w:t>
+      </w:r>
+      <w:r>
+        <w:t>ting</w:t>
+      </w:r>
+      <w:r>
+        <w:t xml:space="preserve"> it back to the Development SME</w:t>
+      </w:r>
+      <w:r>
+        <w:t xml:space="preserve"> for treatment</w:t>
+      </w:r>
+      <w:r>
+        <w:t>.</w:t>
       </w:r>
     </w:p>
     <w:p>
@@ -5041,7 +5096,6 @@
         <w:tc>
           <w:tcPr>
             <w:tcW w:w="1520" w:type="dxa"/>
-            <w:shd w:val="clear" w:color="auto" w:fill="auto"/>
             <w:tcMar>
               <w:top w:w="100" w:type="dxa"/>
               <w:left w:w="100" w:type="dxa"/>
@@ -5072,7 +5126,6 @@
         <w:tc>
           <w:tcPr>
             <w:tcW w:w="2430" w:type="dxa"/>
-            <w:shd w:val="clear" w:color="auto" w:fill="auto"/>
             <w:tcMar>
               <w:top w:w="100" w:type="dxa"/>
               <w:left w:w="100" w:type="dxa"/>
@@ -5095,7 +5148,6 @@
         <w:tc>
           <w:tcPr>
             <w:tcW w:w="1520" w:type="dxa"/>
-            <w:shd w:val="clear" w:color="auto" w:fill="auto"/>
             <w:tcMar>
               <w:top w:w="100" w:type="dxa"/>
               <w:left w:w="100" w:type="dxa"/>
@@ -5126,7 +5178,6 @@
         <w:tc>
           <w:tcPr>
             <w:tcW w:w="2430" w:type="dxa"/>
-            <w:shd w:val="clear" w:color="auto" w:fill="auto"/>
             <w:tcMar>
               <w:top w:w="100" w:type="dxa"/>
               <w:left w:w="100" w:type="dxa"/>
@@ -5149,7 +5200,6 @@
         <w:tc>
           <w:tcPr>
             <w:tcW w:w="1520" w:type="dxa"/>
-            <w:shd w:val="clear" w:color="auto" w:fill="auto"/>
             <w:tcMar>
               <w:top w:w="100" w:type="dxa"/>
               <w:left w:w="100" w:type="dxa"/>
@@ -5180,7 +5230,6 @@
         <w:tc>
           <w:tcPr>
             <w:tcW w:w="2430" w:type="dxa"/>
-            <w:shd w:val="clear" w:color="auto" w:fill="auto"/>
             <w:tcMar>
               <w:top w:w="100" w:type="dxa"/>
               <w:left w:w="100" w:type="dxa"/>
@@ -7864,6 +7913,21 @@
     <w:unhideWhenUsed/>
     <w:rsid w:val="00CE2FF6"/>
   </w:style>
+  <w:style w:type="paragraph" w:customStyle="1" w:styleId="Note">
+    <w:name w:val="Note"/>
+    <w:basedOn w:val="Normal"/>
+    <w:qFormat/>
+    <w:rsid w:val="001C0C58"/>
+    <w:pPr>
+      <w:spacing w:after="240"/>
+      <w:ind w:left="720" w:hanging="720"/>
+      <w:jc w:val="both"/>
+    </w:pPr>
+    <w:rPr>
+      <w:rFonts w:eastAsia="Times New Roman"/>
+      <w:lang w:val="en-US"/>
+    </w:rPr>
+  </w:style>
 </w:styles>
 </file>
 

</xml_diff>